<commit_message>
Stage 11: reviewer upgrades, sequential numbering, v1.2.0 release
</commit_message>
<xml_diff>
--- a/manuscript/Cover_Letter_CPC_JCP.docx
+++ b/manuscript/Cover_Letter_CPC_JCP.docx
@@ -36,16 +36,7 @@
         <w:rPr>
           <w:i/>
         </w:rPr>
-        <w:t>Computer Physics Communications</w:t>
-      </w:r>
-      <w:r>
-        <w:t xml:space="preserve"> / </w:t>
-      </w:r>
-      <w:r>
-        <w:rPr>
-          <w:i/>
-        </w:rPr>
-        <w:t>Journal of Computational Physics</w:t>
+        <w:t>Computer Physics Communications / Journal of Computational Physics</w:t>
       </w:r>
     </w:p>
     <w:p/>
@@ -84,16 +75,7 @@
         <w:rPr>
           <w:i/>
         </w:rPr>
-        <w:t>Computer Physics Communications</w:t>
-      </w:r>
-      <w:r>
-        <w:t xml:space="preserve"> / </w:t>
-      </w:r>
-      <w:r>
-        <w:rPr>
-          <w:i/>
-        </w:rPr>
-        <w:t>Journal of Computational Physics</w:t>
+        <w:t>Computer Physics Communications / Journal of Computational Physics</w:t>
       </w:r>
       <w:r>
         <w:t>.</w:t>
@@ -114,7 +96,13 @@
     <w:p/>
     <w:p>
       <w:r>
-        <w:t>This work advances decisively beyond my prior fixed-state deep-adaptive PINN study (submitted as COMPHY-D-26-00857), which solved the axisymmetric Poisson--Nernst--Planck (PNP) system for a single operating point at a time and required roughly 500 s of retraining per new state. The present manuscript replaces that per-state workflow with a single parameter-conditioned neural operator and, in doing so, contributes the following.</w:t>
+        <w:t>The work combines a numerical-methods contribution with a reusable computational package: a hard-constrained operator ansatz, a controlled accuracy and ablation study, and a documented, MIT-licensed software release that includes trained models, verification reports, and an interactive simulator.</w:t>
+      </w:r>
+    </w:p>
+    <w:p/>
+    <w:p>
+      <w:r>
+        <w:t>This work advances decisively beyond my prior fixed-state deep-adaptive PINN study (submitted as COMPHY-D-26-00857), which solved the axisymmetric Poisson–Nernst–Planck (PNP) system for a single operating point at a time and required roughly 500 s of retraining per new state. The present manuscript replaces that per-state workflow with a single parameter-conditioned neural operator, and it contributes the following.</w:t>
       </w:r>
     </w:p>
     <w:p/>
@@ -131,9 +119,81 @@
       <w:r>
         <w:t xml:space="preserve"> A multi-scale radial physics-informed DeepONet maps the four physical parameters </w:t>
       </w:r>
-      <w:r>
-        <w:t>μ = (V_app, C_0, q_w, R)</w:t>
-      </w:r>
+      <m:oMath xmlns:a="http://schemas.openxmlformats.org/drawingml/2006/main" xmlns:pic="http://schemas.openxmlformats.org/drawingml/2006/picture">
+        <m:r>
+          <m:rPr>
+            <m:sty m:val="p"/>
+          </m:rPr>
+          <m:t>(</m:t>
+        </m:r>
+        <m:sSub>
+          <m:e>
+            <m:r>
+              <m:t>V</m:t>
+            </m:r>
+          </m:e>
+          <m:sub>
+            <m:r>
+              <m:rPr>
+                <m:nor/>
+                <m:sty m:val="p"/>
+              </m:rPr>
+              <m:t>app</m:t>
+            </m:r>
+          </m:sub>
+        </m:sSub>
+        <m:r>
+          <m:rPr>
+            <m:sty m:val="p"/>
+          </m:rPr>
+          <m:t>,</m:t>
+        </m:r>
+        <m:sSub>
+          <m:e>
+            <m:r>
+              <m:t>C</m:t>
+            </m:r>
+          </m:e>
+          <m:sub>
+            <m:r>
+              <m:t>0</m:t>
+            </m:r>
+          </m:sub>
+        </m:sSub>
+        <m:r>
+          <m:rPr>
+            <m:sty m:val="p"/>
+          </m:rPr>
+          <m:t>,</m:t>
+        </m:r>
+        <m:sSub>
+          <m:e>
+            <m:r>
+              <m:t>q</m:t>
+            </m:r>
+          </m:e>
+          <m:sub>
+            <m:r>
+              <m:t>w</m:t>
+            </m:r>
+          </m:sub>
+        </m:sSub>
+        <m:r>
+          <m:rPr>
+            <m:sty m:val="p"/>
+          </m:rPr>
+          <m:t>,</m:t>
+        </m:r>
+        <m:r>
+          <m:t>R</m:t>
+        </m:r>
+        <m:r>
+          <m:rPr>
+            <m:sty m:val="p"/>
+          </m:rPr>
+          <m:t>)</m:t>
+        </m:r>
+      </m:oMath>
       <w:r>
         <w:t xml:space="preserve"> directly to the coupled potential and ionic-concentration fields, eliminating the ~500 s per-state retraining bottleneck of the prior DA-PINN and enabling instant querying of the whole parameter family from a single trained model.</w:t>
       </w:r>
@@ -147,46 +207,283 @@
         <w:rPr>
           <w:b/>
         </w:rPr>
-        <w:t>An exact-boundary, charge-balanced hyperbolic reparameterization.</w:t>
+        <w:t>An exact-boundary, charge-balanced reparameterization.</w:t>
       </w:r>
       <w:r>
-        <w:t xml:space="preserve"> The ansatz </w:t>
+        <w:t xml:space="preserve"> The ansatz predicts a positive concentration sum </w:t>
       </w:r>
+      <m:oMath xmlns:a="http://schemas.openxmlformats.org/drawingml/2006/main" xmlns:pic="http://schemas.openxmlformats.org/drawingml/2006/picture">
+        <m:r>
+          <m:t>s</m:t>
+        </m:r>
+      </m:oMath>
       <w:r>
-        <w:t>s = 2√(c_+ c_-)</w:t>
+        <w:t xml:space="preserve"> and a net charge </w:t>
       </w:r>
+      <m:oMath xmlns:a="http://schemas.openxmlformats.org/drawingml/2006/main" xmlns:pic="http://schemas.openxmlformats.org/drawingml/2006/picture">
+        <m:r>
+          <m:t>ρ</m:t>
+        </m:r>
+      </m:oMath>
+      <w:r>
+        <w:t xml:space="preserve">, with the exponential envelope </w:t>
+      </w:r>
+      <m:oMath xmlns:a="http://schemas.openxmlformats.org/drawingml/2006/main" xmlns:pic="http://schemas.openxmlformats.org/drawingml/2006/picture">
+        <m:r>
+          <m:t>s</m:t>
+        </m:r>
+        <m:r>
+          <m:rPr>
+            <m:sty m:val="p"/>
+          </m:rPr>
+          <m:t>=</m:t>
+        </m:r>
+        <m:r>
+          <m:t>2</m:t>
+        </m:r>
+        <m:r>
+          <m:rPr>
+            <m:sty m:val="p"/>
+          </m:rPr>
+          <m:t>exp</m:t>
+        </m:r>
+        <m:r>
+          <m:rPr>
+            <m:sty m:val="p"/>
+          </m:rPr>
+          <m:t>(</m:t>
+        </m:r>
+        <m:r>
+          <m:rPr>
+            <m:sty m:val="p"/>
+          </m:rPr>
+          <m:t>c</m:t>
+        </m:r>
+        <m:r>
+          <m:rPr>
+            <m:sty m:val="p"/>
+          </m:rPr>
+          <m:t>l</m:t>
+        </m:r>
+        <m:r>
+          <m:rPr>
+            <m:sty m:val="p"/>
+          </m:rPr>
+          <m:t>i</m:t>
+        </m:r>
+        <m:r>
+          <m:rPr>
+            <m:sty m:val="p"/>
+          </m:rPr>
+          <m:t>p</m:t>
+        </m:r>
+        <m:r>
+          <m:rPr>
+            <m:sty m:val="p"/>
+          </m:rPr>
+          <m:t>(</m:t>
+        </m:r>
+        <m:r>
+          <m:t>z</m:t>
+        </m:r>
+        <m:r>
+          <m:rPr>
+            <m:sty m:val="p"/>
+          </m:rPr>
+          <m:t>(</m:t>
+        </m:r>
+        <m:r>
+          <m:t>1</m:t>
+        </m:r>
+        <m:r>
+          <m:rPr>
+            <m:sty m:val="p"/>
+          </m:rPr>
+          <m:t>−</m:t>
+        </m:r>
+        <m:r>
+          <m:t>z</m:t>
+        </m:r>
+        <m:r>
+          <m:rPr>
+            <m:sty m:val="p"/>
+          </m:rPr>
+          <m:t>)</m:t>
+        </m:r>
+        <m:sSub>
+          <m:e>
+            <m:r>
+              <m:t>G</m:t>
+            </m:r>
+          </m:e>
+          <m:sub>
+            <m:r>
+              <m:t>s</m:t>
+            </m:r>
+          </m:sub>
+        </m:sSub>
+        <m:r>
+          <m:rPr>
+            <m:sty m:val="p"/>
+          </m:rPr>
+          <m:t>)</m:t>
+        </m:r>
+        <m:r>
+          <m:rPr>
+            <m:sty m:val="p"/>
+          </m:rPr>
+          <m:t>)</m:t>
+        </m:r>
+      </m:oMath>
       <w:r>
         <w:t xml:space="preserve"> and </w:t>
       </w:r>
+      <m:oMath xmlns:a="http://schemas.openxmlformats.org/drawingml/2006/main" xmlns:pic="http://schemas.openxmlformats.org/drawingml/2006/picture">
+        <m:r>
+          <m:t>ρ</m:t>
+        </m:r>
+        <m:r>
+          <m:rPr>
+            <m:sty m:val="p"/>
+          </m:rPr>
+          <m:t>=</m:t>
+        </m:r>
+        <m:r>
+          <m:t>z</m:t>
+        </m:r>
+        <m:r>
+          <m:rPr>
+            <m:sty m:val="p"/>
+          </m:rPr>
+          <m:t>(</m:t>
+        </m:r>
+        <m:r>
+          <m:t>1</m:t>
+        </m:r>
+        <m:r>
+          <m:rPr>
+            <m:sty m:val="p"/>
+          </m:rPr>
+          <m:t>−</m:t>
+        </m:r>
+        <m:r>
+          <m:t>z</m:t>
+        </m:r>
+        <m:r>
+          <m:rPr>
+            <m:sty m:val="p"/>
+          </m:rPr>
+          <m:t>)</m:t>
+        </m:r>
+        <m:sSub>
+          <m:e>
+            <m:r>
+              <m:t>G</m:t>
+            </m:r>
+          </m:e>
+          <m:sub>
+            <m:r>
+              <m:t>ρ</m:t>
+            </m:r>
+          </m:sub>
+        </m:sSub>
+      </m:oMath>
       <w:r>
-        <w:t>ρ = c_+ - c_-</w:t>
+        <w:t xml:space="preserve">, and reconstructs physical concentrations through the hyperbolic identity </w:t>
       </w:r>
+      <m:oMath xmlns:a="http://schemas.openxmlformats.org/drawingml/2006/main" xmlns:pic="http://schemas.openxmlformats.org/drawingml/2006/picture">
+        <m:sSub>
+          <m:e>
+            <m:r>
+              <m:t>c</m:t>
+            </m:r>
+          </m:e>
+          <m:sub>
+            <m:r>
+              <m:rPr>
+                <m:sty m:val="p"/>
+              </m:rPr>
+              <m:t>±</m:t>
+            </m:r>
+          </m:sub>
+        </m:sSub>
+        <m:r>
+          <m:rPr>
+            <m:sty m:val="p"/>
+          </m:rPr>
+          <m:t>=</m:t>
+        </m:r>
+        <m:r>
+          <m:rPr>
+            <m:sty m:val="p"/>
+          </m:rPr>
+          <m:t>(</m:t>
+        </m:r>
+        <m:rad>
+          <m:radPr>
+            <m:degHide m:val="on"/>
+          </m:radPr>
+          <m:deg/>
+          <m:e>
+            <m:sSup>
+              <m:e>
+                <m:r>
+                  <m:t>s</m:t>
+                </m:r>
+              </m:e>
+              <m:sup>
+                <m:r>
+                  <m:t>2</m:t>
+                </m:r>
+              </m:sup>
+            </m:sSup>
+            <m:r>
+              <m:rPr>
+                <m:sty m:val="p"/>
+              </m:rPr>
+              <m:t>+</m:t>
+            </m:r>
+            <m:sSup>
+              <m:e>
+                <m:r>
+                  <m:t>ρ</m:t>
+                </m:r>
+              </m:e>
+              <m:sup>
+                <m:r>
+                  <m:t>2</m:t>
+                </m:r>
+              </m:sup>
+            </m:sSup>
+          </m:e>
+        </m:rad>
+        <m:r>
+          <m:rPr>
+            <m:sty m:val="p"/>
+          </m:rPr>
+          <m:t>±</m:t>
+        </m:r>
+        <m:r>
+          <m:t>ρ</m:t>
+        </m:r>
+        <m:r>
+          <m:rPr>
+            <m:sty m:val="p"/>
+          </m:rPr>
+          <m:t>)</m:t>
+        </m:r>
+        <m:r>
+          <m:rPr>
+            <m:sty m:val="p"/>
+          </m:rPr>
+          <m:t>/</m:t>
+        </m:r>
+        <m:r>
+          <m:t>2</m:t>
+        </m:r>
+      </m:oMath>
       <w:r>
-        <w:t xml:space="preserve">, with </w:t>
-      </w:r>
-      <w:r>
-        <w:t>c_± = s/2 ± ρ/2</w:t>
-      </w:r>
-      <w:r>
-        <w:t xml:space="preserve"> and the hyperbolic form </w:t>
-      </w:r>
-      <w:r>
-        <w:t>s = 2(clip(z(1-z)G_s))</w:t>
-      </w:r>
-      <w:r>
-        <w:t xml:space="preserve">, </w:t>
-      </w:r>
-      <w:r>
-        <w:t>ρ = z(1-z)G_ρ</w:t>
-      </w:r>
-      <w:r>
-        <w:t>, enforces reservoir boundary conditions exactly (</w:t>
-      </w:r>
-      <w:r>
-        <w:t>c_± → C_0</w:t>
-      </w:r>
-      <w:r>
-        <w:t>) and removes the subtractive cancellation that limits net-charge accuracy. It reduces the net-charge error by approximately 5x--10x relative to an unconstrained output parameterization.</w:t>
+        <w:t>. This enforces the reservoir boundary conditions exactly and removes the subtractive cancellation that limits net-charge accuracy, reducing net-charge error 8.63-fold (DeepONet) and 10.29-fold (FNO) relative to a direct-concentration output.</w:t>
       </w:r>
     </w:p>
     <w:p/>
@@ -201,7 +498,7 @@
         <w:t>A head-to-head operator comparison.</w:t>
       </w:r>
       <w:r>
-        <w:t xml:space="preserve"> The Multi-Scale Radial PI-DeepONet (36,880 parameters, 0.072 ms ONNX latency) is benchmarked directly against a 2D Spectral Fourier Neural Operator (FNO) with 12.49x more parameters (460,488), across both in-distribution and out-of-distribution Debye-overlap regimes, isolating where each architecture succeeds and fails.</w:t>
+        <w:t xml:space="preserve"> The multi-scale radial PI-DeepONet (36,880 parameters, 0.072 ms ONNX latency) is benchmarked against a four-layer real-DFT Fourier neural operator with 12.5-fold more parameters (460,488), across both in-distribution and out-of-distribution Debye-overlap regimes. The DeepONet is 6.16-fold more accurate in potential and 7.79-fold more accurate in current in-distribution, while the FNO is better for net charge and cation concentration out of distribution, isolating where each architecture succeeds.</w:t>
       </w:r>
     </w:p>
     <w:p/>
@@ -216,7 +513,7 @@
         <w:t>An inverse-sensing demonstration and an identifiability result.</w:t>
       </w:r>
       <w:r>
-        <w:t xml:space="preserve"> A gradient-free inverse recovery over the trained operator runs roughly 3,200x faster than the finite-volume/Shell-Gupta reference solver, and reveals a physical conductance identifiability boundary: the pore radius is recoverable from current alone, whereas the surface charge is not (its effect on conductance is &lt;0.2%, well below measurement noise).</w:t>
+        <w:t xml:space="preserve"> A gradient-free inverse recovery runs roughly 3,200-fold faster than the finite-volume reference solver. A Fisher-information analysis and a 15-state, three-protocol study reveal a physical conductance identifiability boundary: the pore radius is recoverable from a five-bias current–voltage curve to 0.46%, whereas the surface charge is a flat direction whose current signature stays below the 1% noise floor at every operating point. Neither single-salt nor multi-salt current–voltage data resolve that charge; adding an independent near-wall selectivity observable recovers both radius and wall charge to below 0.3%.</w:t>
       </w:r>
     </w:p>
     <w:p/>
@@ -228,10 +525,142 @@
         <w:rPr>
           <w:b/>
         </w:rPr>
+        <w:t>Scope-bounding ablations.</w:t>
+      </w:r>
+      <w:r>
+        <w:t xml:space="preserve"> A trunk ablation at matched capacity shows that the multi-scale radial basis is a modest near-wall inductive bias rather than a necessity (about 7% lower wall-gradient error, no bulk-accuracy advantage), and a nested 384-state study gives an in-distribution data-scaling exponent of 0.55 close to the expected N^−1/2, while out-of-distribution error is nearly data-insensitive.</w:t>
+      </w:r>
+    </w:p>
+    <w:p/>
+    <w:p>
+      <w:r>
+        <w:t xml:space="preserve">6. </w:t>
+      </w:r>
+      <w:r>
+        <w:rPr>
+          <w:b/>
+        </w:rPr>
         <w:t>Reproducibility and an interactive tool.</w:t>
       </w:r>
       <w:r>
-        <w:t xml:space="preserve"> A live, serverless browser simulator and a fully open-source MIT-licensed reproducibility package (data, trained seed-42 models in PyTorch and ONNX, scripts, and verification reports) accompany the manuscript.</w:t>
+        <w:t xml:space="preserve"> A verified 240-state benchmark plus a 384-state scaling expansion, trained seed-42 models in PyTorch and ONNX, archived result files, a serverless browser simulator, and an MIT-licensed reproducibility package accompany the manuscript. Every number in the paper is traceable to an archived artifact.</w:t>
+      </w:r>
+    </w:p>
+    <w:p/>
+    <w:p>
+      <w:r>
+        <w:t xml:space="preserve">7. </w:t>
+      </w:r>
+      <w:r>
+        <w:rPr>
+          <w:b/>
+        </w:rPr>
+        <w:t>A four-way constraint benchmark and an exact Jacobian validation.</w:t>
+      </w:r>
+      <w:r>
+        <w:t xml:space="preserve"> Under an identical PI-DeepONet backbone and three seeds, the hyperbolic reparameterization matches the best projection scheme in accuracy while keeping the charge identity exact to machine precision, and a physics-weight sweep identifies </w:t>
+      </w:r>
+      <m:oMath xmlns:a="http://schemas.openxmlformats.org/drawingml/2006/main" xmlns:pic="http://schemas.openxmlformats.org/drawingml/2006/picture">
+        <m:sSup>
+          <m:e>
+            <m:r>
+              <m:t>10</m:t>
+            </m:r>
+          </m:e>
+          <m:sup>
+            <m:r>
+              <m:rPr>
+                <m:sty m:val="p"/>
+              </m:rPr>
+              <m:t>−</m:t>
+            </m:r>
+            <m:r>
+              <m:t>3</m:t>
+            </m:r>
+          </m:sup>
+        </m:sSup>
+      </m:oMath>
+      <w:r>
+        <w:t xml:space="preserve"> as the Pareto point. A centered finite-difference Jacobian of the float64 SG/FV solver validates the operator's Fisher analysis: the two agree on </w:t>
+      </w:r>
+      <m:oMath xmlns:a="http://schemas.openxmlformats.org/drawingml/2006/main" xmlns:pic="http://schemas.openxmlformats.org/drawingml/2006/picture">
+        <m:r>
+          <m:rPr>
+            <m:sty m:val="p"/>
+          </m:rPr>
+          <m:t>∂</m:t>
+        </m:r>
+        <m:r>
+          <m:rPr>
+            <m:sty m:val="p"/>
+          </m:rPr>
+          <m:t>ln</m:t>
+        </m:r>
+        <m:r>
+          <m:t>I</m:t>
+        </m:r>
+        <m:r>
+          <m:rPr>
+            <m:sty m:val="p"/>
+          </m:rPr>
+          <m:t>/</m:t>
+        </m:r>
+        <m:r>
+          <m:rPr>
+            <m:sty m:val="p"/>
+          </m:rPr>
+          <m:t>∂</m:t>
+        </m:r>
+        <m:r>
+          <m:rPr>
+            <m:sty m:val="p"/>
+          </m:rPr>
+          <m:t>ln</m:t>
+        </m:r>
+        <m:r>
+          <m:t>R</m:t>
+        </m:r>
+      </m:oMath>
+      <w:r>
+        <w:t xml:space="preserve"> to </w:t>
+      </w:r>
+      <m:oMath xmlns:a="http://schemas.openxmlformats.org/drawingml/2006/main" xmlns:pic="http://schemas.openxmlformats.org/drawingml/2006/picture">
+        <m:r>
+          <m:t>1.5</m:t>
+        </m:r>
+        <m:r>
+          <m:t>i</m:t>
+        </m:r>
+        <m:r>
+          <m:t>m</m:t>
+        </m:r>
+        <m:r>
+          <m:t>e</m:t>
+        </m:r>
+        <m:r>
+          <m:t>s</m:t>
+        </m:r>
+        <m:sSup>
+          <m:e>
+            <m:r>
+              <m:t>10</m:t>
+            </m:r>
+          </m:e>
+          <m:sup>
+            <m:r>
+              <m:rPr>
+                <m:sty m:val="p"/>
+              </m:rPr>
+              <m:t>−</m:t>
+            </m:r>
+            <m:r>
+              <m:t>4</m:t>
+            </m:r>
+          </m:sup>
+        </m:sSup>
+      </m:oMath>
+      <w:r>
+        <w:t>, and both collapse the charge-conditioning number by ten orders of magnitude once the near-wall selectivity observable is added.</w:t>
       </w:r>
     </w:p>
     <w:p/>
@@ -249,7 +678,7 @@
         <w:t>Data and code availability.</w:t>
       </w:r>
       <w:r>
-        <w:t xml:space="preserve"> The reproducibility package is available at https://github.com/Javad-Alizargar/nanopore-pino-surrogate under the MIT License, and the interactive simulator is hosted at https://javad-alizargar.github.io/nanopore-pino-surrogate/web_simulator/. A permanent Zenodo DOI will be minted upon acceptance.</w:t>
+        <w:t xml:space="preserve"> The reproducibility package is available at https://github.com/Javad-Alizargar/nanopore-pino-surrogate under the MIT License, and the interactive simulator is hosted at https://pino.statwhy.com/. A permanent Zenodo DOI will be minted upon acceptance.</w:t>
       </w:r>
     </w:p>
     <w:p/>

</xml_diff>